<commit_message>
Use the exact CellPatch manifest schema and matching scaffold layouts.
templates/manifest.json is now the coordinator’s array format (key,
replacePattern, string columns, fillDefault=cell). The loader normalizes
it for fill. Scaffold docx row/col layouts follow those coordinates so
dropping real 2.10/2.12/7.2 binaries later is overwrite-only.

Co-authored-by: yydd-gif <yydd-gif@users.noreply.github.com>
</commit_message>
<xml_diff>
--- a/templates/2.10_施工日志.docx
+++ b/templates/2.10_施工日志.docx
@@ -26,7 +26,7 @@
           <w:sz w:val="21"/>
           <w:sz w:val="21"/>
         </w:rPr>
-        <w:t xml:space="preserve">工程名称：×××</w:t>
+        <w:t xml:space="preserve">工程名称：×××工程</w:t>
       </w:r>
     </w:p>
     <w:p>
@@ -39,7 +39,7 @@
           <w:sz w:val="21"/>
           <w:sz w:val="21"/>
         </w:rPr>
-        <w:t xml:space="preserve">编号：YS-XXXXXX</w:t>
+        <w:t xml:space="preserve">编号：项目编号-A25-流水号</w:t>
       </w:r>
     </w:p>
     <w:tbl>
@@ -265,23 +265,24 @@
           <w:tcPr>
             <w:tcW w:w="9300" w:type="dxa"/>
             <w:gridSpan w:val="4"/>
-            <w:shd w:val="clear" w:color="auto" w:fill="6B3A2A"/>
-            <w:tcBorders>
-              <w:top w:val="single" w:sz="4" w:color="6B3A2A"/>
-              <w:left w:val="single" w:sz="4" w:color="6B3A2A"/>
-              <w:bottom w:val="single" w:sz="4" w:color="6B3A2A"/>
-              <w:right w:val="single" w:sz="4" w:color="6B3A2A"/>
-            </w:tcBorders>
-          </w:tcPr>
-          <w:p>
-            <w:r>
-              <w:rPr>
-                <w:b/>
-                <w:color w:val="FFFFFF"/>
-                <w:rFonts w:eastAsia="黑体"/>
-                <w:sz w:val="20"/>
-              </w:rPr>
-              <w:t>当日完成工作内容</w:t>
+            <w:tcBorders>
+              <w:top w:val="single" w:sz="4" w:color="8A6A3A"/>
+              <w:left w:val="single" w:sz="4" w:color="8A6A3A"/>
+              <w:bottom w:val="single" w:sz="4" w:color="8A6A3A"/>
+              <w:right w:val="single" w:sz="4" w:color="8A6A3A"/>
+            </w:tcBorders>
+            <w:shd w:val="clear" w:color="auto" w:fill="FFF8EE"/>
+          </w:tcPr>
+          <w:p>
+            <w:pPr>
+              <w:spacing w:before="40" w:after="40"/>
+            </w:pPr>
+            <w:r>
+              <w:rPr>
+                <w:rFonts w:ascii="宋体" w:hAnsi="宋体" w:eastAsia="宋体"/>
+                <w:sz w:val="21"/>
+              </w:rPr>
+              <w:t xml:space="preserve">今日完成工作：</w:t>
             </w:r>
           </w:p>
         </w:tc>
@@ -335,61 +336,7 @@
                 <w:rFonts w:ascii="宋体" w:hAnsi="宋体" w:eastAsia="宋体"/>
                 <w:sz w:val="21"/>
               </w:rPr>
-              <w:t xml:space="preserve">质量安全检查：                    施工人数：</w:t>
-            </w:r>
-          </w:p>
-        </w:tc>
-      </w:tr>
-      <w:tr>
-        <w:tc>
-          <w:tcPr>
-            <w:tcW w:w="9300" w:type="dxa"/>
-            <w:gridSpan w:val="4"/>
-            <w:tcBorders>
-              <w:top w:val="single" w:sz="4" w:color="8A6A3A"/>
-              <w:left w:val="single" w:sz="4" w:color="8A6A3A"/>
-              <w:bottom w:val="single" w:sz="4" w:color="8A6A3A"/>
-              <w:right w:val="single" w:sz="4" w:color="8A6A3A"/>
-            </w:tcBorders>
-            <w:shd w:val="clear" w:color="auto" w:fill="FFF8EE"/>
-          </w:tcPr>
-          <w:p>
-            <w:pPr>
-              <w:spacing w:before="40" w:after="40"/>
-            </w:pPr>
-            <w:r>
-              <w:rPr>
-                <w:rFonts w:ascii="宋体" w:hAnsi="宋体" w:eastAsia="宋体"/>
-                <w:sz w:val="21"/>
-              </w:rPr>
-              <w:t xml:space="preserve">存在问题：</w:t>
-            </w:r>
-          </w:p>
-        </w:tc>
-      </w:tr>
-      <w:tr>
-        <w:tc>
-          <w:tcPr>
-            <w:tcW w:w="9300" w:type="dxa"/>
-            <w:gridSpan w:val="4"/>
-            <w:tcBorders>
-              <w:top w:val="single" w:sz="4" w:color="8A6A3A"/>
-              <w:left w:val="single" w:sz="4" w:color="8A6A3A"/>
-              <w:bottom w:val="single" w:sz="4" w:color="8A6A3A"/>
-              <w:right w:val="single" w:sz="4" w:color="8A6A3A"/>
-            </w:tcBorders>
-            <w:shd w:val="clear" w:color="auto" w:fill="FFF8EE"/>
-          </w:tcPr>
-          <w:p>
-            <w:pPr>
-              <w:spacing w:before="40" w:after="40"/>
-            </w:pPr>
-            <w:r>
-              <w:rPr>
-                <w:rFonts w:ascii="宋体" w:hAnsi="宋体" w:eastAsia="宋体"/>
-                <w:sz w:val="21"/>
-              </w:rPr>
-              <w:t xml:space="preserve">协调事项：</w:t>
+              <w:t xml:space="preserve">施工人数：  个    现场问题：    需协调事项：</w:t>
             </w:r>
           </w:p>
         </w:tc>

</xml_diff>